<commit_message>
Escape Room: Codes mit mindestens drei Ziffern
Sicherheitsprüfung F4 (Entscheidung Frank): Jeder Escape-Room-Code hat
mindestens drei Ziffern (Validator/berechneCode: 3–8 Ziffern).
- S3: zusätzlich die Schichten des stärksten Stands (64 → 6412)
- S5: neue Code-Quelle „attribute“, Anzahl aller Attribute (43 → 4313)
- S5g: neue Code-Quelle „attributeRichtig“, Attribute aller tauglichen
  Schlüssel zusammen (21 → 213)
Schloss-Hinweise, AUFGABENFORMAT §12, STORY, DS_PLANUNG, Kür-K2-Materialien
(Stationsumschläge, Lehrkraftfassung) und PDFs nachgezogen.

Co-Authored-By: Claude Opus 5.5 <noreply@anthropic.com>
Claude-Session: https://claude.ai/code/session_011AnrXShdxopZcriy7nmq9X
</commit_message>
<xml_diff>
--- a/materialien/Kuer/K2_Escape_Room/DD_K2_Escape_Room_Lehrkraft.docx
+++ b/materialien/Kuer/K2_Escape_Room/DD_K2_Escape_Room_Lehrkraft.docx
@@ -2063,7 +2063,7 @@
                 <w:rFonts w:ascii="IBM Plex Mono" w:hAnsi="IBM Plex Mono" w:eastAsia="IBM Plex Mono" w:cs="IBM Plex Mono"/>
                 <w:sz w:val="15"/>
               </w:rPr>
-              <w:t>64</w:t>
+              <w:t>6412</w:t>
             </w:r>
           </w:p>
         </w:tc>
@@ -2085,7 +2085,7 @@
               <w:rPr>
                 <w:sz w:val="17"/>
               </w:rPr>
-              <w:t>Erste Ziffer = Anzahl der Stände in eurem Ergebnis, zweite Ziffer = StandNr des Stands mit den meisten Schichten.</w:t>
+              <w:t>Erste Ziffer = Anzahl der Stände in eurem Ergebnis, zweite Ziffer = StandNr des Stands mit den meisten Schichten, danach seine Anzahl an Schichten.</w:t>
             </w:r>
           </w:p>
         </w:tc>
@@ -2245,7 +2245,7 @@
                 <w:rFonts w:ascii="IBM Plex Mono" w:hAnsi="IBM Plex Mono" w:eastAsia="IBM Plex Mono" w:cs="IBM Plex Mono"/>
                 <w:sz w:val="15"/>
               </w:rPr>
-              <w:t>43</w:t>
+              <w:t>4313</w:t>
             </w:r>
           </w:p>
         </w:tc>
@@ -2267,7 +2267,7 @@
               <w:rPr>
                 <w:sz w:val="17"/>
               </w:rPr>
-              <w:t>Erste Ziffer = Anzahl der Relationen, zweite Ziffer = Anzahl der Fremdschlüssel in eurem Schema.</w:t>
+              <w:t>Erste Ziffer = Anzahl der Relationen, zweite Ziffer = Anzahl der Fremdschlüssel in eurem Schema, danach die Anzahl aller Attribute in allen Relationen zusammen.</w:t>
             </w:r>
           </w:p>
         </w:tc>
@@ -2336,7 +2336,7 @@
                 <w:rFonts w:ascii="IBM Plex Mono" w:hAnsi="IBM Plex Mono" w:eastAsia="IBM Plex Mono" w:cs="IBM Plex Mono"/>
                 <w:sz w:val="15"/>
               </w:rPr>
-              <w:t>21</w:t>
+              <w:t>213</w:t>
             </w:r>
           </w:p>
         </w:tc>
@@ -2358,7 +2358,7 @@
               <w:rPr>
                 <w:sz w:val="17"/>
               </w:rPr>
-              <w:t>Erste Ziffer = Anzahl der tauglichen Schlüssel, zweite Ziffer = Anzahl der Attribute im kleinsten tauglichen Schlüssel.</w:t>
+              <w:t>Erste Ziffer = Anzahl der tauglichen Schlüssel, zweite Ziffer = Anzahl der Attribute im kleinsten tauglichen Schlüssel, dritte Ziffer = Anzahl der Attribute aller tauglichen Schlüssel zusammen.</w:t>
             </w:r>
           </w:p>
         </w:tc>
@@ -3430,7 +3430,7 @@
         <w:pStyle w:val="Heading3"/>
       </w:pPr>
       <w:r>
-        <w:t>S3 · Die Geldkassette – Code 64</w:t>
+        <w:t>S3 · Die Geldkassette – Code 6412</w:t>
       </w:r>
     </w:p>
     <w:p>
@@ -4031,13 +4031,13 @@
               <w:spacing w:after="60"/>
             </w:pPr>
             <w:r>
-              <w:t xml:space="preserve">6 Stände, stärkster Stand Nr. 4 → Code </w:t>
+              <w:t xml:space="preserve">6 Stände, stärkster Stand Nr. 4 mit 12 Schichten → Code </w:t>
             </w:r>
             <w:r>
               <w:rPr>
                 <w:b/>
               </w:rPr>
-              <w:t>64</w:t>
+              <w:t>6412</w:t>
             </w:r>
             <w:r>
               <w:t>. Kompetenzen K26, K27, K22.</w:t>
@@ -4319,7 +4319,7 @@
         <w:pStyle w:val="Heading3"/>
       </w:pPr>
       <w:r>
-        <w:t>S5 · Die Planrolle (eA) – Code 43</w:t>
+        <w:t>S5 · Die Planrolle (eA) – Code 4313</w:t>
       </w:r>
     </w:p>
     <w:tbl>
@@ -4521,13 +4521,13 @@
               <w:spacing w:after="60"/>
             </w:pPr>
             <w:r>
-              <w:t xml:space="preserve">4 Relationen, 3 Fremdschlüssel → Code </w:t>
+              <w:t xml:space="preserve">4 Relationen, 3 Fremdschlüssel, 13 Attribute → Code </w:t>
             </w:r>
             <w:r>
               <w:rPr>
                 <w:b/>
               </w:rPr>
-              <w:t>43</w:t>
+              <w:t>4313</w:t>
             </w:r>
             <w:r>
               <w:t>. Kompetenzen K41, K34.</w:t>
@@ -4575,7 +4575,7 @@
         <w:pStyle w:val="Heading3"/>
       </w:pPr>
       <w:r>
-        <w:t>S5g · Der Schlüsselkasten (gA) – Code 21</w:t>
+        <w:t>S5g · Der Schlüsselkasten (gA) – Code 213</w:t>
       </w:r>
     </w:p>
     <w:tbl>
@@ -4637,13 +4637,13 @@
               <w:spacing w:after="60"/>
             </w:pPr>
             <w:r>
-              <w:t xml:space="preserve">2 taugliche Schlüssel, der kleinste hat 1 Attribut → Code </w:t>
+              <w:t xml:space="preserve">2 taugliche Schlüssel, der kleinste hat 1 Attribut, zusammen 3 Attribute → Code </w:t>
             </w:r>
             <w:r>
               <w:rPr>
                 <w:b/>
               </w:rPr>
-              <w:t>21</w:t>
+              <w:t>213</w:t>
             </w:r>
             <w:r>
               <w:t>. Kompetenz K02.</w:t>

</xml_diff>